<commit_message>
almmst done, gotta revise discussion
</commit_message>
<xml_diff>
--- a/output/writing/DissertationChapter/mcgrealCh1_draft3DD_TQ 20 May 2026.docx
+++ b/output/writing/DissertationChapter/mcgrealCh1_draft3DD_TQ 20 May 2026.docx
@@ -4644,10 +4644,7 @@
         <w:t>t</w:t>
       </w:r>
       <w:r>
-        <w:t>) in the post-1975 model)</w:t>
-      </w:r>
-      <w:r>
-        <w:t>.</w:t>
+        <w:t>) in the post-1975 model).</w:t>
       </w:r>
     </w:p>
     <w:p>
@@ -4718,13 +4715,7 @@
         <w:t xml:space="preserve">Indian River </w:t>
       </w:r>
       <w:r>
-        <w:t>pink salmon abundances as</w:t>
-      </w:r>
-      <w:r>
-        <w:t xml:space="preserve"> part of a single underlying state represented by all streams in the region</w:t>
-      </w:r>
-      <w:r>
-        <w:t xml:space="preserve"> should fit the data best.</w:t>
+        <w:t>pink salmon abundances as part of a single underlying state represented by all streams in the region should fit the data best.</w:t>
       </w:r>
       <w:r>
         <w:t xml:space="preserve"> </w:t>
@@ -5238,111 +5229,9 @@
     <w:p>
       <w:pPr>
         <w:spacing w:after="0" w:line="240" w:lineRule="auto"/>
-        <w:rPr>
-          <w:i/>
-          <w:iCs/>
-          <w:sz w:val="20"/>
-          <w:szCs w:val="20"/>
-        </w:rPr>
-      </w:pPr>
-      <w:r>
-        <w:rPr>
-          <w:i/>
-          <w:iCs/>
-          <w:sz w:val="20"/>
-          <w:szCs w:val="20"/>
-        </w:rPr>
-        <w:t xml:space="preserve">Figure </w:t>
-      </w:r>
-      <w:r>
-        <w:rPr>
-          <w:i/>
-          <w:iCs/>
-          <w:sz w:val="20"/>
-          <w:szCs w:val="20"/>
-        </w:rPr>
-        <w:t>3</w:t>
-      </w:r>
-      <w:r>
-        <w:rPr>
-          <w:i/>
-          <w:iCs/>
-          <w:sz w:val="20"/>
-          <w:szCs w:val="20"/>
-        </w:rPr>
-        <w:t xml:space="preserve">: MARSS model results estimating the underlying states of </w:t>
-      </w:r>
-      <w:r>
-        <w:rPr>
-          <w:i/>
-          <w:iCs/>
-          <w:sz w:val="20"/>
-          <w:szCs w:val="20"/>
-        </w:rPr>
-        <w:t>even- and odd</w:t>
-      </w:r>
-      <w:r>
-        <w:rPr>
-          <w:i/>
-          <w:iCs/>
-          <w:sz w:val="20"/>
-          <w:szCs w:val="20"/>
-        </w:rPr>
-        <w:t xml:space="preserve">-year pink salmon abundance at Indian River (highlighted in pink) and throughout </w:t>
-      </w:r>
-      <w:r>
-        <w:rPr>
-          <w:i/>
-          <w:iCs/>
-          <w:sz w:val="20"/>
-          <w:szCs w:val="20"/>
-        </w:rPr>
-        <w:t>‘</w:t>
-      </w:r>
-      <w:r>
-        <w:rPr>
-          <w:i/>
-          <w:iCs/>
-          <w:sz w:val="20"/>
-          <w:szCs w:val="20"/>
-        </w:rPr>
-        <w:t>north southeast (outside)</w:t>
-      </w:r>
-      <w:r>
-        <w:rPr>
-          <w:i/>
-          <w:iCs/>
-          <w:sz w:val="20"/>
-          <w:szCs w:val="20"/>
-        </w:rPr>
-        <w:t>’</w:t>
-      </w:r>
-      <w:r>
-        <w:rPr>
-          <w:i/>
-          <w:iCs/>
-          <w:sz w:val="20"/>
-          <w:szCs w:val="20"/>
-        </w:rPr>
-        <w:t xml:space="preserve"> region (grey). Abundance estimates are </w:t>
-      </w:r>
-      <w:r>
-        <w:rPr>
-          <w:i/>
-          <w:iCs/>
-          <w:sz w:val="20"/>
-          <w:szCs w:val="20"/>
-        </w:rPr>
-        <w:t>s</w:t>
-      </w:r>
-      <w:r>
-        <w:rPr>
-          <w:i/>
-          <w:iCs/>
-          <w:sz w:val="20"/>
-          <w:szCs w:val="20"/>
-        </w:rPr>
-        <w:t xml:space="preserve">caled by stream length and z-standardized at the stream level. </w:t>
+      </w:pPr>
+      <w:r>
+        <w:t xml:space="preserve">Figure 3: MARSS model results estimating the underlying states of even- and odd-year pink salmon abundance at Indian River (highlighted in pink) and throughout ‘north southeast (outside)’ region (grey). Abundance estimates are scaled by stream length and z-standardized at the stream level. </w:t>
       </w:r>
     </w:p>
     <w:p>
@@ -5412,11 +5301,11 @@
         <w:t xml:space="preserve">Indian River </w:t>
       </w:r>
       <w:r>
-        <w:t xml:space="preserve">runs are closely aligned with the average index stream, exceeding the average in some years and falling short in others, but in </w:t>
+        <w:t xml:space="preserve">runs are closely aligned with the </w:t>
       </w:r>
       <w:r>
         <w:lastRenderedPageBreak/>
-        <w:t>either case not by an amount that appears drastic when visually appraised</w:t>
+        <w:t>average index stream, exceeding the average in some years and falling short in others, but in either case not by an amount that appears drastic when visually appraised</w:t>
       </w:r>
       <w:r>
         <w:t xml:space="preserve"> (Figure 3)</w:t>
@@ -5425,10 +5314,7 @@
         <w:t>.</w:t>
       </w:r>
       <w:r>
-        <w:t xml:space="preserve"> </w:t>
-      </w:r>
-      <w:r>
-        <w:t>Pink salmon abundances observed in recent years at Indian River did not deviate significantly from the regional average. However, plotting these time series is not enough to conclusively state that abundances at Indian River do not differ from those that would be expected of an average pink salmon index stream in the region in a statistically significant way.</w:t>
+        <w:t xml:space="preserve"> Pink salmon abundances observed in recent years at Indian River did not deviate significantly from the regional average. However, plotting these time series is not enough to conclusively state that abundances at Indian River do not differ from those that would be expected of an average pink salmon index stream in the region in a statistically significant way.</w:t>
       </w:r>
     </w:p>
     <w:p>
@@ -5570,11 +5456,11 @@
         <w:t>(Mazerolle 2006).</w:t>
       </w:r>
       <w:r>
-        <w:t xml:space="preserve"> Model specifications which estimated a single state of odd-year pink salmon abundance throughout the region performed abysmally by this standard, with infinitesimally small likelihoods of best fit. These </w:t>
+        <w:t xml:space="preserve"> Model specifications which estimated a single state of odd-year pink salmon abundance throughout the region </w:t>
       </w:r>
       <w:r>
         <w:lastRenderedPageBreak/>
-        <w:t xml:space="preserve">findings suggest a scenario in which even-year pink salmon abundances at Indian River are very much in line with those that might be expected of an average stream in the </w:t>
+        <w:t xml:space="preserve">performed abysmally by this standard, with infinitesimally small likelihoods of best fit. These findings suggest a scenario in which even-year pink salmon abundances at Indian River are very much in line with those that might be expected of an average stream in the </w:t>
       </w:r>
       <w:r>
         <w:rPr>
@@ -5610,7 +5496,6 @@
           <w:bCs/>
         </w:rPr>
       </w:pPr>
-      <w:commentRangeStart w:id="5"/>
       <w:r>
         <w:rPr>
           <w:b/>
@@ -5621,22 +5506,32 @@
     </w:p>
     <w:p>
       <w:pPr>
-        <w:rPr>
-          <w:sz w:val="20"/>
-          <w:szCs w:val="20"/>
-        </w:rPr>
-      </w:pPr>
+        <w:spacing w:after="0" w:line="480" w:lineRule="auto"/>
+      </w:pPr>
+      <w:r>
+        <w:t>For both the post-1975 and post-2010 treatment periods, m</w:t>
+      </w:r>
+      <w:r>
+        <w:t>odels</w:t>
+      </w:r>
+      <w:r>
+        <w:t xml:space="preserve"> which best fit the data were those</w:t>
+      </w:r>
+      <w:r>
+        <w:t xml:space="preserve"> </w:t>
+      </w:r>
+      <w:r>
+        <w:t xml:space="preserve">specified to assert one region wide effect of treatment period for each run across all sites </w:t>
+      </w:r>
       <w:r>
         <w:rPr>
           <w:noProof/>
-          <w:sz w:val="20"/>
-          <w:szCs w:val="20"/>
         </w:rPr>
         <w:drawing>
-          <wp:inline distT="0" distB="0" distL="0" distR="0" wp14:anchorId="1900FDD3" wp14:editId="5616422C">
-            <wp:extent cx="5934075" cy="3267075"/>
-            <wp:effectExtent l="0" t="0" r="9525" b="9525"/>
-            <wp:docPr id="995212610" name="Picture 8" descr="The image displays a table presenting the difference-in-difference models for Indian River pink salmon, comparing even and odd years (1980 and 2010) and showing the Indian River effect with various coefficients and their significance levels.&#10;&#10;AI-generated content may be incorrect."/>
+          <wp:inline distT="0" distB="0" distL="0" distR="0" wp14:anchorId="2A760248" wp14:editId="0C4258C1">
+            <wp:extent cx="5943600" cy="3278505"/>
+            <wp:effectExtent l="0" t="0" r="0" b="0"/>
+            <wp:docPr id="717413142" name="Picture 1" descr="The diagram presents a statistical comparison of different models, specifically the AICc (Akaike Information Criterion corrected) values and the number of models for various configurations across different years, including two-state and three-state models for regions and odd/even categories.&#10;&#10;AI-generated content may be incorrect."/>
             <wp:cNvGraphicFramePr>
               <a:graphicFrameLocks xmlns:a="http://schemas.openxmlformats.org/drawingml/2006/main" noChangeAspect="1"/>
             </wp:cNvGraphicFramePr>
@@ -5644,36 +5539,23 @@
               <a:graphicData uri="http://schemas.openxmlformats.org/drawingml/2006/picture">
                 <pic:pic xmlns:pic="http://schemas.openxmlformats.org/drawingml/2006/picture">
                   <pic:nvPicPr>
-                    <pic:cNvPr id="995212610" name="Picture 8" descr="The image displays a table presenting the difference-in-difference models for Indian River pink salmon, comparing even and odd years (1980 and 2010) and showing the Indian River effect with various coefficients and their significance levels.&#10;&#10;AI-generated content may be incorrect."/>
-                    <pic:cNvPicPr>
-                      <a:picLocks noChangeAspect="1" noChangeArrowheads="1"/>
-                    </pic:cNvPicPr>
+                    <pic:cNvPr id="1614438269" name="Picture 1" descr="The diagram presents a statistical comparison of different models, specifically the AICc (Akaike Information Criterion corrected) values and the number of models for various configurations across different years, including two-state and three-state models for regions and odd/even categories.&#10;&#10;AI-generated content may be incorrect."/>
+                    <pic:cNvPicPr/>
                   </pic:nvPicPr>
                   <pic:blipFill>
-                    <a:blip r:embed="rId16" cstate="print">
-                      <a:extLst>
-                        <a:ext uri="{28A0092B-C50C-407E-A947-70E740481C1C}">
-                          <a14:useLocalDpi xmlns:a14="http://schemas.microsoft.com/office/drawing/2010/main" val="0"/>
-                        </a:ext>
-                      </a:extLst>
-                    </a:blip>
-                    <a:srcRect/>
+                    <a:blip r:embed="rId16"/>
                     <a:stretch>
                       <a:fillRect/>
                     </a:stretch>
                   </pic:blipFill>
-                  <pic:spPr bwMode="auto">
+                  <pic:spPr>
                     <a:xfrm>
                       <a:off x="0" y="0"/>
-                      <a:ext cx="5934075" cy="3267075"/>
+                      <a:ext cx="5943600" cy="3278505"/>
                     </a:xfrm>
                     <a:prstGeom prst="rect">
                       <a:avLst/>
                     </a:prstGeom>
-                    <a:noFill/>
-                    <a:ln>
-                      <a:noFill/>
-                    </a:ln>
                   </pic:spPr>
                 </pic:pic>
               </a:graphicData>
@@ -5681,10 +5563,13 @@
           </wp:inline>
         </w:drawing>
       </w:r>
-    </w:p>
-    <w:p>
-      <w:pPr>
-        <w:spacing w:after="0"/>
+      <w:r>
+        <w:t xml:space="preserve"> </w:t>
+      </w:r>
+    </w:p>
+    <w:p>
+      <w:pPr>
+        <w:spacing w:after="0" w:line="240" w:lineRule="auto"/>
         <w:rPr>
           <w:i/>
           <w:iCs/>
@@ -5693,75 +5578,60 @@
         </w:rPr>
       </w:pPr>
       <w:r>
+        <w:t xml:space="preserve">Table 2: Difference-in-difference results estimating the impact of Sheldon Jackson Hatchery operations on Indian River pink salmon abundances. Best fit model effect structure in bold. The lowest (best) AICc value for each effect structure is included, along with the number of models featuring said effect structure within 2 AICc of the best fit model. </w:t>
+      </w:r>
+    </w:p>
+    <w:p>
+      <w:pPr>
+        <w:spacing w:after="0" w:line="480" w:lineRule="auto"/>
+      </w:pPr>
+    </w:p>
+    <w:p>
+      <w:pPr>
+        <w:spacing w:after="0" w:line="480" w:lineRule="auto"/>
+      </w:pPr>
+      <w:r>
+        <w:lastRenderedPageBreak/>
+        <w:t>(including Indian River), implying that in both treatment periods, any effect hatchery releases may be having on Indian River pink salmon abundances is not as impactful as the effect of the</w:t>
+      </w:r>
+    </w:p>
+    <w:p>
+      <w:pPr>
+        <w:spacing w:after="0" w:line="480" w:lineRule="auto"/>
+      </w:pPr>
+      <w:r>
+        <w:t xml:space="preserve">treatment period itself. For the post-1975 treatment, over 75% of models within 2 AICc of the best fit model were specified with the same region wide effect structure. Conversely, while the post-2010 treatment best fit model was specified with the same region wide effect structure, fully half of the models that fell within 2 AICc of best fit were specified to only estimate an effect of treatment at Indian River (Table 2).  </w:t>
+      </w:r>
+    </w:p>
+    <w:p>
+      <w:pPr>
+        <w:spacing w:after="0" w:line="480" w:lineRule="auto"/>
+      </w:pPr>
+    </w:p>
+    <w:p>
+      <w:pPr>
+        <w:spacing w:after="0" w:line="240" w:lineRule="auto"/>
+        <w:jc w:val="center"/>
         <w:rPr>
           <w:i/>
           <w:iCs/>
           <w:sz w:val="20"/>
           <w:szCs w:val="20"/>
         </w:rPr>
-        <w:t xml:space="preserve">Table </w:t>
-      </w:r>
+      </w:pPr>
       <w:r>
         <w:rPr>
           <w:i/>
           <w:iCs/>
+          <w:noProof/>
           <w:sz w:val="20"/>
           <w:szCs w:val="20"/>
         </w:rPr>
-        <w:t>2: Event studies evaluating the effect of Indian River on pink salmon abundances during pre-treatment periods. Standard errors reported in parentheses.</w:t>
-      </w:r>
-    </w:p>
-    <w:p>
-      <w:pPr>
-        <w:spacing w:after="0"/>
-        <w:rPr>
-          <w:i/>
-          <w:iCs/>
-          <w:sz w:val="20"/>
-          <w:szCs w:val="20"/>
-        </w:rPr>
-      </w:pPr>
-    </w:p>
-    <w:p>
-      <w:pPr>
-        <w:spacing w:after="0" w:line="480" w:lineRule="auto"/>
-      </w:pPr>
-      <w:r>
-        <w:t>Difference-in-difference models for even- and odd-year runs considering post-1980 and post-2010 treatment periods were specified, with suites of covariate data relating to observers and ocean climate evaluated for best fit. To ensure the parallel trends assumption holds, th</w:t>
-      </w:r>
-      <w:r>
-        <w:t>e effect of Indian River in the pre-treatment period i</w:t>
-      </w:r>
-      <w:r>
-        <w:t>s estimated in</w:t>
-      </w:r>
-      <w:r>
-        <w:t xml:space="preserve"> all four models</w:t>
-      </w:r>
-      <w:r>
-        <w:t xml:space="preserve"> (Table 2)</w:t>
-      </w:r>
-      <w:r>
-        <w:t xml:space="preserve">. For even-year runs there exists some significant difference between trends at Indian River and elsewhere in the region prior to 1980. Due to this difference, a synthetic control group time series was </w:t>
-      </w:r>
-      <w:r>
-        <w:lastRenderedPageBreak/>
-        <w:t>constructed for comparison with the treatment group. All other models satisfy the parallel trends assumption.</w:t>
-      </w:r>
-    </w:p>
-    <w:p>
-      <w:pPr>
-        <w:spacing w:after="0" w:line="240" w:lineRule="auto"/>
-      </w:pPr>
-      <w:r>
-        <w:rPr>
-          <w:noProof/>
-        </w:rPr>
         <w:drawing>
-          <wp:inline distT="0" distB="0" distL="0" distR="0" wp14:anchorId="63A97548" wp14:editId="77052691">
-            <wp:extent cx="5934075" cy="4933950"/>
-            <wp:effectExtent l="0" t="0" r="9525" b="0"/>
-            <wp:docPr id="1642919015" name="Picture 9" descr="The diagram illustrates the difference-in-difference models comparing the effects of time, Indian River, and treatment on Indian River pink salmon, with significant results marked by asterisks.&#10;&#10;AI-generated content may be incorrect."/>
+          <wp:inline distT="0" distB="0" distL="0" distR="0" wp14:anchorId="6767CCB0" wp14:editId="14246956">
+            <wp:extent cx="4654789" cy="3587934"/>
+            <wp:effectExtent l="0" t="0" r="0" b="0"/>
+            <wp:docPr id="2011708144" name="Picture 1" descr="The image presents a table comparing different statistical models used in a diff-in-diff event study, specifically detailing the Akaike Information Criterion (AICc) values for various combinations of treatment periods and state configurations.&#10;&#10;AI-generated content may be incorrect."/>
             <wp:cNvGraphicFramePr>
               <a:graphicFrameLocks xmlns:a="http://schemas.openxmlformats.org/drawingml/2006/main" noChangeAspect="1"/>
             </wp:cNvGraphicFramePr>
@@ -5769,36 +5639,23 @@
               <a:graphicData uri="http://schemas.openxmlformats.org/drawingml/2006/picture">
                 <pic:pic xmlns:pic="http://schemas.openxmlformats.org/drawingml/2006/picture">
                   <pic:nvPicPr>
-                    <pic:cNvPr id="1642919015" name="Picture 9" descr="The diagram illustrates the difference-in-difference models comparing the effects of time, Indian River, and treatment on Indian River pink salmon, with significant results marked by asterisks.&#10;&#10;AI-generated content may be incorrect."/>
-                    <pic:cNvPicPr>
-                      <a:picLocks noChangeAspect="1" noChangeArrowheads="1"/>
-                    </pic:cNvPicPr>
+                    <pic:cNvPr id="2011708144" name="Picture 1" descr="The image presents a table comparing different statistical models used in a diff-in-diff event study, specifically detailing the Akaike Information Criterion (AICc) values for various combinations of treatment periods and state configurations.&#10;&#10;AI-generated content may be incorrect."/>
+                    <pic:cNvPicPr/>
                   </pic:nvPicPr>
                   <pic:blipFill>
-                    <a:blip r:embed="rId17" cstate="print">
-                      <a:extLst>
-                        <a:ext uri="{28A0092B-C50C-407E-A947-70E740481C1C}">
-                          <a14:useLocalDpi xmlns:a14="http://schemas.microsoft.com/office/drawing/2010/main" val="0"/>
-                        </a:ext>
-                      </a:extLst>
-                    </a:blip>
-                    <a:srcRect/>
+                    <a:blip r:embed="rId17"/>
                     <a:stretch>
                       <a:fillRect/>
                     </a:stretch>
                   </pic:blipFill>
-                  <pic:spPr bwMode="auto">
+                  <pic:spPr>
                     <a:xfrm>
                       <a:off x="0" y="0"/>
-                      <a:ext cx="5934075" cy="4933950"/>
+                      <a:ext cx="4654789" cy="3587934"/>
                     </a:xfrm>
                     <a:prstGeom prst="rect">
                       <a:avLst/>
                     </a:prstGeom>
-                    <a:noFill/>
-                    <a:ln>
-                      <a:noFill/>
-                    </a:ln>
                   </pic:spPr>
                 </pic:pic>
               </a:graphicData>
@@ -5810,433 +5667,311 @@
     <w:p>
       <w:pPr>
         <w:spacing w:after="0" w:line="240" w:lineRule="auto"/>
-        <w:ind w:left="360"/>
+      </w:pPr>
+      <w:r>
         <w:rPr>
           <w:i/>
           <w:iCs/>
           <w:sz w:val="20"/>
           <w:szCs w:val="20"/>
         </w:rPr>
-      </w:pPr>
-    </w:p>
-    <w:p>
-      <w:pPr>
-        <w:spacing w:after="0" w:line="240" w:lineRule="auto"/>
+        <w:t xml:space="preserve">Table </w:t>
+      </w:r>
+      <w:r>
         <w:rPr>
           <w:i/>
           <w:iCs/>
           <w:sz w:val="20"/>
           <w:szCs w:val="20"/>
         </w:rPr>
-      </w:pPr>
+        <w:t>3: Event studies evaluating the effect of Indian River on pink salmon abundances during pre-treatment periods. Best fit models in both treatment periods include separate states of Indian River and regional abundances in odd years and only one regional underlying state (including Indian River) in even years.</w:t>
+      </w:r>
+    </w:p>
+    <w:p>
+      <w:pPr>
+        <w:spacing w:after="0" w:line="480" w:lineRule="auto"/>
+      </w:pPr>
+    </w:p>
+    <w:p>
+      <w:pPr>
+        <w:spacing w:after="0" w:line="480" w:lineRule="auto"/>
+        <w:ind w:firstLine="720"/>
+      </w:pPr>
+      <w:r>
+        <w:t xml:space="preserve">Event studies conducted to validate the parallel trends assumption revealed that, in both pre-treatment periods, best fit models were those specified with a 3-state structure, treating </w:t>
+      </w:r>
+      <w:r>
+        <w:lastRenderedPageBreak/>
+        <w:t>odd-year Indian River pink salmon runs as separate state from odd-year runs throughout the region (Table 3). This then means that the parallel trends assumption is not supported for odd-year abundances at Indian River and throughout the region, a very interesting finding when</w:t>
+      </w:r>
+      <w:r>
+        <w:t xml:space="preserve"> </w:t>
+      </w:r>
+      <w:r>
+        <w:t>considered in conjunction with the best fit models described above (Table 2). These findings are consistent with the idea that the statistically significant difference observed between odd-year Indian River and regional abundances discussed in the last section is being driven by the Indian River falling below regional expectations in the pre-treatment period (Figure 3).</w:t>
+      </w:r>
+    </w:p>
+    <w:p>
+      <w:pPr>
+        <w:spacing w:after="0" w:line="480" w:lineRule="auto"/>
+        <w:rPr>
+          <w:b/>
+          <w:bCs/>
+        </w:rPr>
+      </w:pPr>
+    </w:p>
+    <w:p>
+      <w:pPr>
+        <w:spacing w:after="0" w:line="480" w:lineRule="auto"/>
+        <w:rPr>
+          <w:b/>
+          <w:bCs/>
+        </w:rPr>
+      </w:pPr>
+      <w:r>
+        <w:rPr>
+          <w:b/>
+          <w:bCs/>
+        </w:rPr>
+        <w:t>Effect of Hatchery Releases</w:t>
+      </w:r>
+    </w:p>
+    <w:p>
+      <w:pPr>
+        <w:spacing w:after="0" w:line="480" w:lineRule="auto"/>
+      </w:pPr>
+      <w:r>
+        <w:t>All</w:t>
+      </w:r>
+      <w:r>
+        <w:t xml:space="preserve"> interaction effects of brood year </w:t>
+      </w:r>
       <w:r>
         <w:rPr>
           <w:i/>
           <w:iCs/>
-          <w:sz w:val="20"/>
-          <w:szCs w:val="20"/>
-        </w:rPr>
-        <w:t xml:space="preserve">Table </w:t>
+        </w:rPr>
+        <w:t>t-1</w:t>
+      </w:r>
+      <w:r>
+        <w:t xml:space="preserve"> on brood year </w:t>
       </w:r>
       <w:r>
         <w:rPr>
           <w:i/>
           <w:iCs/>
-          <w:sz w:val="20"/>
-          <w:szCs w:val="20"/>
-        </w:rPr>
-        <w:t>3: Difference-in-difference results estimating the impact of Sheldon Jackson Hatchery operations on Indian River pink salmon abundances. Standard errors reported in parentheses.</w:t>
-      </w:r>
-    </w:p>
-    <w:p>
-      <w:pPr>
-        <w:spacing w:after="0" w:line="480" w:lineRule="auto"/>
-      </w:pPr>
-    </w:p>
-    <w:p>
-      <w:pPr>
-        <w:spacing w:after="0" w:line="480" w:lineRule="auto"/>
-        <w:ind w:firstLine="720"/>
-        <w:rPr>
-          <w:b/>
-          <w:bCs/>
-        </w:rPr>
-      </w:pPr>
-      <w:r>
-        <w:t xml:space="preserve">The commencement of SJH operations in 1980 </w:t>
-      </w:r>
-      <w:r>
-        <w:t>caused</w:t>
-      </w:r>
-      <w:r>
-        <w:t xml:space="preserve"> a significant increase in odd-year pink salmon abundances at Indian River, </w:t>
-      </w:r>
-      <w:r>
-        <w:t>but</w:t>
-      </w:r>
-      <w:r>
-        <w:t xml:space="preserve"> no significant </w:t>
-      </w:r>
-      <w:r>
-        <w:t>effect occurred for</w:t>
-      </w:r>
-      <w:r>
-        <w:t xml:space="preserve"> even-year runs. The expansion of permitted pink salmon releases from 1 million to 3 million in 2010 increase</w:t>
-      </w:r>
-      <w:r>
-        <w:t>d</w:t>
-      </w:r>
-      <w:r>
-        <w:t xml:space="preserve"> both even- and odd-year</w:t>
-      </w:r>
-      <w:r>
-        <w:t xml:space="preserve"> a</w:t>
-      </w:r>
-      <w:r>
-        <w:t>bundances (Table 3). The difference in time periods (pre- and post-198</w:t>
-      </w:r>
-      <w:commentRangeStart w:id="6"/>
+        </w:rPr>
+        <w:t>t</w:t>
+      </w:r>
+      <w:r>
+        <w:t xml:space="preserve"> are positive for both runs (Figure </w:t>
+      </w:r>
+      <w:r>
+        <w:t>4</w:t>
+      </w:r>
+      <w:r>
+        <w:t xml:space="preserve">). </w:t>
+      </w:r>
+      <w:r>
+        <w:t xml:space="preserve">The </w:t>
+      </w:r>
+      <w:r>
+        <w:t xml:space="preserve">average </w:t>
+      </w:r>
+      <w:r>
+        <w:t>e</w:t>
+      </w:r>
+      <w:r>
+        <w:t>ffect of prior brood year hatchery returns on current brood year Indian River abundance</w:t>
+      </w:r>
+      <w:r>
+        <w:t>, the parameter of greatest interest,</w:t>
+      </w:r>
+      <w:r>
+        <w:t xml:space="preserve"> was</w:t>
+      </w:r>
+      <w:r>
+        <w:t xml:space="preserve"> </w:t>
+      </w:r>
+      <w:r>
+        <w:t xml:space="preserve">positive </w:t>
+      </w:r>
+      <w:r>
+        <w:t>for both even- and odd-year runs</w:t>
+      </w:r>
+      <w:r>
+        <w:t xml:space="preserve">, although this </w:t>
+      </w:r>
+      <w:r>
+        <w:t xml:space="preserve">was </w:t>
+      </w:r>
+      <w:r>
+        <w:t>the smallest of the three effects observed for each run, with point estimates of 0.</w:t>
+      </w:r>
+      <w:r>
+        <w:t>09</w:t>
+      </w:r>
+      <w:r>
+        <w:t xml:space="preserve"> and 0.</w:t>
+      </w:r>
+      <w:r>
+        <w:t>04</w:t>
+      </w:r>
+      <w:r>
+        <w:t xml:space="preserve"> respectively</w:t>
+      </w:r>
+      <w:r>
+        <w:t>.</w:t>
+      </w:r>
+      <w:r>
+        <w:t xml:space="preserve"> </w:t>
+      </w:r>
+      <w:r>
+        <w:t>I</w:t>
+      </w:r>
+      <w:r>
+        <w:t>n both cases enough parameter estimates fell below zero to diminish statistical confidence in the result</w:t>
+      </w:r>
+      <w:r>
+        <w:t>,</w:t>
+      </w:r>
+      <w:r>
+        <w:t xml:space="preserve"> </w:t>
+      </w:r>
+      <w:r>
+        <w:t xml:space="preserve">but </w:t>
+      </w:r>
+      <w:r>
+        <w:t>most</w:t>
+      </w:r>
+      <w:r>
+        <w:t xml:space="preserve"> bootstrapped parameter estimates were positive (94.2% in even-year runs, and 92% in odd-year runs).</w:t>
+      </w:r>
+      <w:r>
+        <w:t xml:space="preserve"> </w:t>
+      </w:r>
+      <w:r>
+        <w:t>Not surprisingly</w:t>
+      </w:r>
+      <w:r>
+        <w:t>,</w:t>
+      </w:r>
+      <w:r>
+        <w:t xml:space="preserve"> t</w:t>
+      </w:r>
+      <w:r>
+        <w:t>he river shows a significant positive effect on itself</w:t>
+      </w:r>
+      <w:r>
+        <w:t xml:space="preserve"> </w:t>
+      </w:r>
+      <w:r>
+        <w:t xml:space="preserve">for both odd- and even-year runs </w:t>
+      </w:r>
+      <w:r>
+        <w:t>(</w:t>
+      </w:r>
+      <w:r>
+        <w:t>point estimates</w:t>
+      </w:r>
+      <w:r>
+        <w:t xml:space="preserve"> of </w:t>
+      </w:r>
+      <w:r>
+        <w:t>0.</w:t>
+      </w:r>
+      <w:r>
+        <w:t>92</w:t>
+      </w:r>
+      <w:r>
+        <w:t xml:space="preserve"> in even years and 0.</w:t>
+      </w:r>
+      <w:r>
+        <w:t>96</w:t>
+      </w:r>
+      <w:r>
+        <w:t xml:space="preserve"> in odd years</w:t>
+      </w:r>
+      <w:r>
+        <w:t xml:space="preserve">), meaning that the strongest predictor of </w:t>
+      </w:r>
+      <w:r>
+        <w:t xml:space="preserve">the size of an </w:t>
+      </w:r>
+      <w:r>
+        <w:t>Indian River pink salmon</w:t>
+      </w:r>
+      <w:r>
+        <w:t xml:space="preserve"> is the size of the run in the previous brood year</w:t>
+      </w:r>
+      <w:r>
+        <w:t xml:space="preserve">. </w:t>
+      </w:r>
+      <w:r>
+        <w:t>B</w:t>
+      </w:r>
+      <w:r>
+        <w:t xml:space="preserve">oth even- and odd-year hatchery returns are </w:t>
+      </w:r>
+      <w:r>
+        <w:t xml:space="preserve">also </w:t>
+      </w:r>
+      <w:r>
+        <w:t xml:space="preserve">significantly influenced by </w:t>
+      </w:r>
+      <w:r>
+        <w:t>prior brood year</w:t>
+      </w:r>
+      <w:r>
+        <w:t xml:space="preserve"> Indian River abundances</w:t>
+      </w:r>
+      <w:r>
+        <w:t>, with the model</w:t>
+      </w:r>
+      <w:r>
+        <w:t xml:space="preserve"> finding respective</w:t>
+      </w:r>
+      <w:r>
+        <w:t xml:space="preserve"> point estimates of </w:t>
+      </w:r>
       <w:r>
         <w:t>0</w:t>
       </w:r>
-      <w:ins w:id="7" w:author="tquinn" w:date="2026-05-22T10:45:00Z" w16du:dateUtc="2026-05-22T17:45:00Z">
-        <w:r>
-          <w:t xml:space="preserve"> [</w:t>
-        </w:r>
-        <w:r>
-          <w:rPr>
-            <w:highlight w:val="yellow"/>
-            <w:rPrChange w:id="8" w:author="tquinn" w:date="2026-05-22T10:45:00Z" w16du:dateUtc="2026-05-22T17:45:00Z">
-              <w:rPr/>
-            </w:rPrChange>
-          </w:rPr>
-          <w:t>but the Methods section says 1975 so be consistent on this</w:t>
-        </w:r>
-        <w:r>
-          <w:t>]</w:t>
-        </w:r>
-      </w:ins>
-      <w:r>
-        <w:t xml:space="preserve">, </w:t>
-      </w:r>
-      <w:commentRangeEnd w:id="6"/>
-      <w:r>
-        <w:rPr>
-          <w:rStyle w:val="CommentReference"/>
-          <w:sz w:val="24"/>
-          <w:szCs w:val="24"/>
-        </w:rPr>
-        <w:commentReference w:id="6"/>
-      </w:r>
-      <w:r>
-        <w:t xml:space="preserve">and pre- and post-2010) is </w:t>
+      <w:r>
+        <w:t>.</w:t>
+      </w:r>
+      <w:r>
+        <w:t>6</w:t>
+      </w:r>
+      <w:r>
+        <w:t>31</w:t>
+      </w:r>
+      <w:r>
+        <w:t xml:space="preserve"> and 0.</w:t>
+      </w:r>
+      <w:r>
+        <w:t>311</w:t>
+      </w:r>
+      <w:r>
+        <w:t>.</w:t>
+      </w:r>
+      <w:r>
+        <w:t xml:space="preserve"> </w:t>
+      </w:r>
+      <w:r>
+        <w:t xml:space="preserve">While the effect of prior brood year Indian River abundances on current brood year hatchery returns is stronger for both </w:t>
       </w:r>
       <w:r>
         <w:lastRenderedPageBreak/>
-        <w:t xml:space="preserve">found to be a significant driver of pink salmon abundances both at Indian River and throughout the </w:t>
-      </w:r>
-      <w:r>
-        <w:rPr>
-          <w:i/>
-          <w:iCs/>
-        </w:rPr>
-        <w:t>north southeast (outside)</w:t>
-      </w:r>
-      <w:r>
-        <w:t xml:space="preserve"> region. This result is consistent with trends seen in ADFG’s survey data (Figure 2), as well as </w:t>
-      </w:r>
-      <w:r>
-        <w:t xml:space="preserve">with </w:t>
-      </w:r>
-      <w:r>
-        <w:t xml:space="preserve">the </w:t>
-      </w:r>
-      <w:r>
-        <w:t>underlying</w:t>
-      </w:r>
-      <w:r>
-        <w:t xml:space="preserve"> states of pink salmon abundance </w:t>
-      </w:r>
-      <w:r>
-        <w:t>estimated through MARSS modeling (</w:t>
-      </w:r>
-      <w:r>
-        <w:t>Figure 3</w:t>
-      </w:r>
-      <w:r>
-        <w:t>)</w:t>
-      </w:r>
-      <w:r>
-        <w:t xml:space="preserve">. </w:t>
-      </w:r>
-      <w:commentRangeEnd w:id="5"/>
-      <w:r>
-        <w:rPr>
-          <w:rStyle w:val="CommentReference"/>
-          <w:b/>
-          <w:bCs/>
-          <w:sz w:val="24"/>
-          <w:szCs w:val="24"/>
-        </w:rPr>
-        <w:commentReference w:id="5"/>
-      </w:r>
-    </w:p>
-    <w:p>
-      <w:pPr>
-        <w:rPr>
-          <w:b/>
-          <w:bCs/>
-        </w:rPr>
-      </w:pPr>
-    </w:p>
-    <w:p>
-      <w:pPr>
-        <w:spacing w:after="0" w:line="480" w:lineRule="auto"/>
-        <w:rPr>
-          <w:b/>
-          <w:bCs/>
-        </w:rPr>
-      </w:pPr>
-      <w:r>
-        <w:rPr>
-          <w:b/>
-          <w:bCs/>
-        </w:rPr>
-        <w:t>Effect of Hatchery Releases</w:t>
-      </w:r>
-    </w:p>
-    <w:p>
-      <w:pPr>
-        <w:spacing w:after="0" w:line="480" w:lineRule="auto"/>
-      </w:pPr>
-      <w:r>
-        <w:t>All</w:t>
-      </w:r>
-      <w:r>
-        <w:t xml:space="preserve"> interaction effects of brood year </w:t>
-      </w:r>
-      <w:r>
-        <w:rPr>
-          <w:i/>
-          <w:iCs/>
-        </w:rPr>
-        <w:t>t-1</w:t>
-      </w:r>
-      <w:r>
-        <w:t xml:space="preserve"> on brood year </w:t>
-      </w:r>
-      <w:r>
-        <w:rPr>
-          <w:i/>
-          <w:iCs/>
-        </w:rPr>
-        <w:t>t</w:t>
-      </w:r>
-      <w:r>
-        <w:t xml:space="preserve"> are positive for both runs (Figure </w:t>
-      </w:r>
-      <w:r>
-        <w:t>4</w:t>
-      </w:r>
-      <w:r>
-        <w:t xml:space="preserve">). </w:t>
-      </w:r>
-      <w:r>
-        <w:t xml:space="preserve">The </w:t>
-      </w:r>
-      <w:r>
-        <w:t xml:space="preserve">average </w:t>
-      </w:r>
-      <w:r>
-        <w:t>e</w:t>
-      </w:r>
-      <w:r>
-        <w:t>ffect of prior brood year hatchery returns on current brood year Indian River abundance</w:t>
-      </w:r>
-      <w:r>
-        <w:t>, the parameter of greatest interest,</w:t>
-      </w:r>
-      <w:r>
-        <w:t xml:space="preserve"> was</w:t>
-      </w:r>
-      <w:r>
-        <w:t xml:space="preserve"> </w:t>
-      </w:r>
-      <w:r>
-        <w:t xml:space="preserve">positive </w:t>
-      </w:r>
-      <w:r>
-        <w:t>for both even- and odd-year runs</w:t>
-      </w:r>
-      <w:r>
-        <w:t xml:space="preserve">, although this </w:t>
-      </w:r>
-      <w:r>
-        <w:t xml:space="preserve">was </w:t>
-      </w:r>
-      <w:r>
-        <w:t>the smallest of the three effects observed for each run, with point estimates of 0.</w:t>
-      </w:r>
-      <w:r>
-        <w:t>09</w:t>
-      </w:r>
-      <w:r>
-        <w:t xml:space="preserve"> and 0.</w:t>
-      </w:r>
-      <w:r>
-        <w:t>04</w:t>
-      </w:r>
-      <w:r>
-        <w:t xml:space="preserve"> respectively</w:t>
-      </w:r>
-      <w:r>
-        <w:t>.</w:t>
-      </w:r>
-      <w:r>
-        <w:t xml:space="preserve"> </w:t>
-      </w:r>
-      <w:r>
-        <w:t>I</w:t>
-      </w:r>
-      <w:r>
-        <w:t>n both cases enough parameter estimates fell below zero to diminish statistical confidence in the result</w:t>
+        <w:t xml:space="preserve">runs than its inverse, it is crucial to note that hatchery returns are </w:t>
+      </w:r>
+      <w:r>
+        <w:t>greater than Indian River abundance much more often than not. This means that</w:t>
       </w:r>
       <w:r>
         <w:t>,</w:t>
       </w:r>
       <w:r>
-        <w:t xml:space="preserve"> </w:t>
-      </w:r>
-      <w:r>
-        <w:t xml:space="preserve">but </w:t>
-      </w:r>
-      <w:r>
-        <w:t>most</w:t>
-      </w:r>
-      <w:r>
-        <w:t xml:space="preserve"> bootstrapped parameter estimates were positive (94.2% in even-year runs, and 92% in odd-year runs).</w:t>
-      </w:r>
-      <w:r>
-        <w:t xml:space="preserve"> </w:t>
-      </w:r>
-      <w:r>
-        <w:t>Not surprisingly</w:t>
-      </w:r>
-      <w:r>
-        <w:t>,</w:t>
-      </w:r>
-      <w:r>
-        <w:t xml:space="preserve"> t</w:t>
-      </w:r>
-      <w:r>
-        <w:t>he river shows a significant positive effect on itself</w:t>
-      </w:r>
-      <w:r>
-        <w:t xml:space="preserve"> </w:t>
-      </w:r>
-      <w:r>
-        <w:t xml:space="preserve">for both odd- and even-year runs </w:t>
-      </w:r>
-      <w:r>
-        <w:t>(</w:t>
-      </w:r>
-      <w:r>
-        <w:t>point estimates</w:t>
-      </w:r>
-      <w:r>
-        <w:t xml:space="preserve"> of </w:t>
-      </w:r>
-      <w:r>
-        <w:t>0.</w:t>
-      </w:r>
-      <w:r>
-        <w:t>92</w:t>
-      </w:r>
-      <w:r>
-        <w:t xml:space="preserve"> in even years and 0.</w:t>
-      </w:r>
-      <w:r>
-        <w:t>96</w:t>
-      </w:r>
-      <w:r>
-        <w:t xml:space="preserve"> in odd years</w:t>
-      </w:r>
-      <w:r>
-        <w:t xml:space="preserve">), meaning that the strongest predictor of </w:t>
-      </w:r>
-      <w:r>
-        <w:t xml:space="preserve">the size of an </w:t>
-      </w:r>
-      <w:r>
-        <w:t>Indian River pink salmon</w:t>
-      </w:r>
-      <w:r>
-        <w:t xml:space="preserve"> is the size of the run in the previous brood year</w:t>
-      </w:r>
-      <w:r>
-        <w:t xml:space="preserve">. </w:t>
-      </w:r>
-      <w:r>
-        <w:t>B</w:t>
-      </w:r>
-      <w:r>
-        <w:t xml:space="preserve">oth even- and odd-year hatchery returns are </w:t>
-      </w:r>
-      <w:r>
-        <w:t xml:space="preserve">also </w:t>
-      </w:r>
-      <w:r>
-        <w:t xml:space="preserve">significantly influenced by </w:t>
-      </w:r>
-      <w:r>
-        <w:t>prior brood year</w:t>
-      </w:r>
-      <w:r>
-        <w:t xml:space="preserve"> Indian River abundances</w:t>
-      </w:r>
-      <w:r>
-        <w:t>, with the model</w:t>
-      </w:r>
-      <w:r>
-        <w:t xml:space="preserve"> finding respective</w:t>
-      </w:r>
-      <w:r>
-        <w:t xml:space="preserve"> point estimates of </w:t>
-      </w:r>
-      <w:r>
-        <w:t>0</w:t>
-      </w:r>
-      <w:r>
-        <w:t>.</w:t>
-      </w:r>
-      <w:r>
-        <w:t>6</w:t>
-      </w:r>
-      <w:r>
-        <w:t>31</w:t>
-      </w:r>
-      <w:r>
-        <w:t xml:space="preserve"> and 0.</w:t>
-      </w:r>
-      <w:r>
-        <w:t>311</w:t>
-      </w:r>
-      <w:r>
-        <w:t>.</w:t>
-      </w:r>
-      <w:r>
-        <w:t xml:space="preserve"> </w:t>
-      </w:r>
-      <w:r>
-        <w:t xml:space="preserve">While the effect of prior brood year Indian River abundances on current brood year hatchery returns is stronger for both runs than its inverse, it is crucial to note that hatchery returns are </w:t>
-      </w:r>
-      <w:r>
-        <w:t>greater than Indian River abundance much more often than not. This means that</w:t>
-      </w:r>
-      <w:r>
-        <w:t>,</w:t>
-      </w:r>
-      <w:r>
         <w:t xml:space="preserve"> despite the difference in effect, the overall numbers of fish </w:t>
       </w:r>
       <w:r>
@@ -6252,11 +5987,7 @@
         <w:t xml:space="preserve">site </w:t>
       </w:r>
       <w:r>
-        <w:t xml:space="preserve">could be roughly equal or even skewed </w:t>
-      </w:r>
-      <w:r>
-        <w:lastRenderedPageBreak/>
-        <w:t>towards hatchery-born fish returning to Indian River. In those brood years where Indian River abundances exceed hatchery returns, these effect</w:t>
+        <w:t>could be roughly equal or even skewed towards hatchery-born fish returning to Indian River. In those brood years where Indian River abundances exceed hatchery returns, these effect</w:t>
       </w:r>
       <w:r>
         <w:t xml:space="preserve"> size</w:t>
@@ -6291,7 +6022,7 @@
           <w:szCs w:val="20"/>
         </w:rPr>
         <w:drawing>
-          <wp:inline distT="0" distB="0" distL="0" distR="0" wp14:anchorId="524AAB61" wp14:editId="20A2C984">
+          <wp:inline distT="0" distB="0" distL="0" distR="0" wp14:anchorId="524AAB61" wp14:editId="1651A3EF">
             <wp:extent cx="6960541" cy="3239548"/>
             <wp:effectExtent l="0" t="0" r="0" b="0"/>
             <wp:docPr id="1324619098" name="Picture 6" descr="The diagram presents a statistical comparison of the effects of previous year's hatchery returns on the current year's brood counts for different species, including Indian River, with a focus on even and odd years.&#10;&#10;AI-generated content may be incorrect."/>
@@ -6402,15 +6133,42 @@
         <w:spacing w:after="0" w:line="480" w:lineRule="auto"/>
         <w:ind w:firstLine="720"/>
       </w:pPr>
-      <w:ins w:id="9" w:author="tquinn" w:date="2026-05-22T10:49:00Z" w16du:dateUtc="2026-05-22T17:49:00Z">
+      <w:ins w:id="5" w:author="tquinn" w:date="2026-05-22T10:49:00Z" w16du:dateUtc="2026-05-22T17:49:00Z">
         <w:r>
           <w:rPr>
             <w:highlight w:val="yellow"/>
-            <w:rPrChange w:id="10" w:author="tquinn" w:date="2026-05-22T10:52:00Z" w16du:dateUtc="2026-05-22T17:52:00Z">
+            <w:rPrChange w:id="6" w:author="tquinn" w:date="2026-05-22T10:52:00Z" w16du:dateUtc="2026-05-22T17:52:00Z">
               <w:rPr/>
             </w:rPrChange>
           </w:rPr>
           <w:t>I think it is important here, at the start of the Discussion, to remind the readers exactly what hypotheses were tested, and then make sure, in non-statistical terms, they know what the findings were</w:t>
+        </w:r>
+      </w:ins>
+      <w:ins w:id="7" w:author="tquinn" w:date="2026-05-22T10:50:00Z" w16du:dateUtc="2026-05-22T17:50:00Z">
+        <w:r>
+          <w:rPr>
+            <w:highlight w:val="yellow"/>
+            <w:rPrChange w:id="8" w:author="tquinn" w:date="2026-05-22T10:52:00Z" w16du:dateUtc="2026-05-22T17:52:00Z">
+              <w:rPr/>
+            </w:rPrChange>
+          </w:rPr>
+          <w:t>. Going back into the Introduction themes leaves the reader unsure what the true outcome was</w:t>
+        </w:r>
+      </w:ins>
+      <w:ins w:id="9" w:author="tquinn" w:date="2026-05-22T10:53:00Z" w16du:dateUtc="2026-05-22T17:53:00Z">
+        <w:r>
+          <w:rPr>
+            <w:highlight w:val="yellow"/>
+          </w:rPr>
+          <w:t xml:space="preserve">, and I am </w:t>
+        </w:r>
+      </w:ins>
+      <w:ins w:id="10" w:author="tquinn" w:date="2026-05-22T10:54:00Z" w16du:dateUtc="2026-05-22T17:54:00Z">
+        <w:r>
+          <w:rPr>
+            <w:highlight w:val="yellow"/>
+          </w:rPr>
+          <w:t>not at all sure</w:t>
         </w:r>
       </w:ins>
       <w:ins w:id="11" w:author="tquinn" w:date="2026-05-22T10:50:00Z" w16du:dateUtc="2026-05-22T17:50:00Z">
@@ -6421,52 +6179,25 @@
               <w:rPr/>
             </w:rPrChange>
           </w:rPr>
-          <w:t>. Going back into the Introduction themes leaves the reader unsure what the true outcome was</w:t>
+          <w:t>. Once we all know that, then you w</w:t>
         </w:r>
       </w:ins>
-      <w:ins w:id="13" w:author="tquinn" w:date="2026-05-22T10:53:00Z" w16du:dateUtc="2026-05-22T17:53:00Z">
+      <w:ins w:id="13" w:author="tquinn" w:date="2026-05-22T10:51:00Z" w16du:dateUtc="2026-05-22T17:51:00Z">
         <w:r>
           <w:rPr>
             <w:highlight w:val="yellow"/>
-          </w:rPr>
-          <w:t xml:space="preserve">, and I am </w:t>
-        </w:r>
-      </w:ins>
-      <w:ins w:id="14" w:author="tquinn" w:date="2026-05-22T10:54:00Z" w16du:dateUtc="2026-05-22T17:54:00Z">
-        <w:r>
-          <w:rPr>
-            <w:highlight w:val="yellow"/>
-          </w:rPr>
-          <w:t>not at all sure</w:t>
-        </w:r>
-      </w:ins>
-      <w:ins w:id="15" w:author="tquinn" w:date="2026-05-22T10:50:00Z" w16du:dateUtc="2026-05-22T17:50:00Z">
-        <w:r>
-          <w:rPr>
-            <w:highlight w:val="yellow"/>
-            <w:rPrChange w:id="16" w:author="tquinn" w:date="2026-05-22T10:52:00Z" w16du:dateUtc="2026-05-22T17:52:00Z">
-              <w:rPr/>
-            </w:rPrChange>
-          </w:rPr>
-          <w:t>. Once we all know that, then you w</w:t>
-        </w:r>
-      </w:ins>
-      <w:ins w:id="17" w:author="tquinn" w:date="2026-05-22T10:51:00Z" w16du:dateUtc="2026-05-22T17:51:00Z">
-        <w:r>
-          <w:rPr>
-            <w:highlight w:val="yellow"/>
-            <w:rPrChange w:id="18" w:author="tquinn" w:date="2026-05-22T10:52:00Z" w16du:dateUtc="2026-05-22T17:52:00Z">
+            <w:rPrChange w:id="14" w:author="tquinn" w:date="2026-05-22T10:52:00Z" w16du:dateUtc="2026-05-22T17:52:00Z">
               <w:rPr/>
             </w:rPrChange>
           </w:rPr>
           <w:t>ant to discuss your findings per se, followed by gradually broadening the scope to discuss them in light of broader conservation concerns for salmon (wild – hatchery, etc.) and then for other animals. A paragraph for caveats follows that</w:t>
         </w:r>
       </w:ins>
-      <w:ins w:id="19" w:author="tquinn" w:date="2026-05-22T10:52:00Z" w16du:dateUtc="2026-05-22T17:52:00Z">
+      <w:ins w:id="15" w:author="tquinn" w:date="2026-05-22T10:52:00Z" w16du:dateUtc="2026-05-22T17:52:00Z">
         <w:r>
           <w:rPr>
             <w:highlight w:val="yellow"/>
-            <w:rPrChange w:id="20" w:author="tquinn" w:date="2026-05-22T10:52:00Z" w16du:dateUtc="2026-05-22T17:52:00Z">
+            <w:rPrChange w:id="16" w:author="tquinn" w:date="2026-05-22T10:52:00Z" w16du:dateUtc="2026-05-22T17:52:00Z">
               <w:rPr/>
             </w:rPrChange>
           </w:rPr>
@@ -6654,14 +6385,14 @@
       <w:r>
         <w:t xml:space="preserve"> those recorded decades ago, more contemporary </w:t>
       </w:r>
-      <w:ins w:id="21" w:author="tquinn" w:date="2026-05-22T16:34:00Z" w16du:dateUtc="2026-05-22T23:34:00Z">
+      <w:ins w:id="17" w:author="tquinn" w:date="2026-05-22T16:34:00Z" w16du:dateUtc="2026-05-22T23:34:00Z">
         <w:r>
           <w:t>[</w:t>
         </w:r>
         <w:r>
           <w:rPr>
             <w:highlight w:val="yellow"/>
-            <w:rPrChange w:id="22" w:author="tquinn" w:date="2026-05-22T16:34:00Z" w16du:dateUtc="2026-05-22T23:34:00Z">
+            <w:rPrChange w:id="18" w:author="tquinn" w:date="2026-05-22T16:34:00Z" w16du:dateUtc="2026-05-22T23:34:00Z">
               <w:rPr/>
             </w:rPrChange>
           </w:rPr>
@@ -6689,11 +6420,11 @@
       <w:r>
         <w:t xml:space="preserve"> </w:t>
       </w:r>
-      <w:ins w:id="23" w:author="tquinn" w:date="2026-05-22T11:01:00Z" w16du:dateUtc="2026-05-22T18:01:00Z">
+      <w:ins w:id="19" w:author="tquinn" w:date="2026-05-22T11:01:00Z" w16du:dateUtc="2026-05-22T18:01:00Z">
         <w:r>
           <w:rPr>
             <w:highlight w:val="yellow"/>
-            <w:rPrChange w:id="24" w:author="tquinn" w:date="2026-05-22T11:01:00Z" w16du:dateUtc="2026-05-22T18:01:00Z">
+            <w:rPrChange w:id="20" w:author="tquinn" w:date="2026-05-22T11:01:00Z" w16du:dateUtc="2026-05-22T18:01:00Z">
               <w:rPr/>
             </w:rPrChange>
           </w:rPr>
@@ -6743,25 +6474,25 @@
         <w:lastRenderedPageBreak/>
         <w:t>brood year Indian River abundances, the overall numbers of fish straying to a non-origin site could be roughly equal or even skewed towards hatchery-born fish returning to Indian River</w:t>
       </w:r>
-      <w:ins w:id="25" w:author="tquinn" w:date="2026-05-22T16:38:00Z" w16du:dateUtc="2026-05-22T23:38:00Z">
+      <w:ins w:id="21" w:author="tquinn" w:date="2026-05-22T16:38:00Z" w16du:dateUtc="2026-05-22T23:38:00Z">
         <w:r>
           <w:t xml:space="preserve"> [</w:t>
         </w:r>
         <w:r>
           <w:rPr>
             <w:highlight w:val="yellow"/>
-            <w:rPrChange w:id="26" w:author="tquinn" w:date="2026-05-22T16:39:00Z" w16du:dateUtc="2026-05-22T23:39:00Z">
+            <w:rPrChange w:id="22" w:author="tquinn" w:date="2026-05-22T16:39:00Z" w16du:dateUtc="2026-05-22T23:39:00Z">
               <w:rPr/>
             </w:rPrChange>
           </w:rPr>
           <w:t>This sentence is long and complicated and I am having trouble untangling it. Are you suggesting that if there are more hatchery than natural origin fish, and equal straying rates for each, there will be more hatch</w:t>
         </w:r>
       </w:ins>
-      <w:ins w:id="27" w:author="tquinn" w:date="2026-05-22T16:39:00Z" w16du:dateUtc="2026-05-22T23:39:00Z">
+      <w:ins w:id="23" w:author="tquinn" w:date="2026-05-22T16:39:00Z" w16du:dateUtc="2026-05-22T23:39:00Z">
         <w:r>
           <w:rPr>
             <w:highlight w:val="yellow"/>
-            <w:rPrChange w:id="28" w:author="tquinn" w:date="2026-05-22T16:39:00Z" w16du:dateUtc="2026-05-22T23:39:00Z">
+            <w:rPrChange w:id="24" w:author="tquinn" w:date="2026-05-22T16:39:00Z" w16du:dateUtc="2026-05-22T23:39:00Z">
               <w:rPr/>
             </w:rPrChange>
           </w:rPr>
@@ -6907,18 +6638,18 @@
       <w:r>
         <w:t xml:space="preserve">from what would be expected of a similar </w:t>
       </w:r>
-      <w:ins w:id="29" w:author="tquinn" w:date="2026-05-22T16:59:00Z" w16du:dateUtc="2026-05-22T23:59:00Z">
+      <w:ins w:id="25" w:author="tquinn" w:date="2026-05-22T16:59:00Z" w16du:dateUtc="2026-05-22T23:59:00Z">
         <w:r>
           <w:rPr>
             <w:highlight w:val="yellow"/>
-            <w:rPrChange w:id="30" w:author="tquinn" w:date="2026-05-22T17:00:00Z" w16du:dateUtc="2026-05-23T00:00:00Z">
+            <w:rPrChange w:id="26" w:author="tquinn" w:date="2026-05-22T17:00:00Z" w16du:dateUtc="2026-05-23T00:00:00Z">
               <w:rPr/>
             </w:rPrChange>
           </w:rPr>
           <w:t>[in what way</w:t>
         </w:r>
       </w:ins>
-      <w:ins w:id="31" w:author="tquinn" w:date="2026-05-22T17:00:00Z" w16du:dateUtc="2026-05-23T00:00:00Z">
+      <w:ins w:id="27" w:author="tquinn" w:date="2026-05-22T17:00:00Z" w16du:dateUtc="2026-05-23T00:00:00Z">
         <w:r>
           <w:t xml:space="preserve">?] </w:t>
         </w:r>
@@ -7104,32 +6835,32 @@
       <w:r>
         <w:t xml:space="preserve">s lower than the effect observed in even years. If there exists some small but positive true effect of hatchery releases on subsequent brood year Indian River abundances, the difference between the magnitude of these effects in odd years would be far less than in even-years, meaning that odd-year Indian River abundances would be more susceptible to being inflated by hatchery releases. It is possible that limiting the number of SJH pink salmon moving into Indian River to spawn in odd years may be beneficial for maintaining the wild population in the park within their natural range of variation, but this is far from conclusive, and suggests the need for more consistent otolith sampling </w:t>
       </w:r>
-      <w:ins w:id="32" w:author="tquinn" w:date="2026-05-22T17:13:00Z" w16du:dateUtc="2026-05-23T00:13:00Z">
+      <w:ins w:id="28" w:author="tquinn" w:date="2026-05-22T17:13:00Z" w16du:dateUtc="2026-05-23T00:13:00Z">
         <w:r>
           <w:t>[</w:t>
         </w:r>
       </w:ins>
-      <w:ins w:id="33" w:author="tquinn" w:date="2026-05-22T17:14:00Z" w16du:dateUtc="2026-05-23T00:14:00Z">
+      <w:ins w:id="29" w:author="tquinn" w:date="2026-05-22T17:14:00Z" w16du:dateUtc="2026-05-23T00:14:00Z">
         <w:r>
           <w:t>H</w:t>
         </w:r>
       </w:ins>
-      <w:ins w:id="34" w:author="tquinn" w:date="2026-05-22T17:13:00Z" w16du:dateUtc="2026-05-23T00:13:00Z">
+      <w:ins w:id="30" w:author="tquinn" w:date="2026-05-22T17:13:00Z" w16du:dateUtc="2026-05-23T00:13:00Z">
         <w:r>
           <w:t xml:space="preserve">as this </w:t>
         </w:r>
       </w:ins>
-      <w:ins w:id="35" w:author="tquinn" w:date="2026-05-22T17:14:00Z" w16du:dateUtc="2026-05-23T00:14:00Z">
+      <w:ins w:id="31" w:author="tquinn" w:date="2026-05-22T17:14:00Z" w16du:dateUtc="2026-05-23T00:14:00Z">
         <w:r>
           <w:t xml:space="preserve">method </w:t>
         </w:r>
       </w:ins>
-      <w:ins w:id="36" w:author="tquinn" w:date="2026-05-22T17:13:00Z" w16du:dateUtc="2026-05-23T00:13:00Z">
+      <w:ins w:id="32" w:author="tquinn" w:date="2026-05-22T17:13:00Z" w16du:dateUtc="2026-05-23T00:13:00Z">
         <w:r>
           <w:t>been described and the results presented?</w:t>
         </w:r>
       </w:ins>
-      <w:ins w:id="37" w:author="tquinn" w:date="2026-05-22T17:14:00Z" w16du:dateUtc="2026-05-23T00:14:00Z">
+      <w:ins w:id="33" w:author="tquinn" w:date="2026-05-22T17:14:00Z" w16du:dateUtc="2026-05-23T00:14:00Z">
         <w:r>
           <w:t xml:space="preserve">] </w:t>
         </w:r>
@@ -8875,38 +8606,6 @@
       </w:r>
     </w:p>
   </w:comment>
-  <w:comment w:id="6" w:author="Brian E McGreal" w:date="2026-06-05T18:19:00Z" w:initials="BM">
-    <w:p>
-      <w:pPr>
-        <w:pStyle w:val="CommentText"/>
-      </w:pPr>
-      <w:r>
-        <w:rPr>
-          <w:rStyle w:val="CommentReference"/>
-        </w:rPr>
-        <w:annotationRef/>
-      </w:r>
-      <w:r>
-        <w:t>Making adjustments here because tom is right. The first impacted years should be 1977 and 1978. HOWEVER, I’ll wait until I meet with mark to talk about the MARSS BACI approach</w:t>
-      </w:r>
-    </w:p>
-  </w:comment>
-  <w:comment w:id="5" w:author="Brian E McGreal" w:date="2026-06-15T16:11:00Z" w:initials="BM">
-    <w:p>
-      <w:pPr>
-        <w:pStyle w:val="CommentText"/>
-      </w:pPr>
-      <w:r>
-        <w:rPr>
-          <w:rStyle w:val="CommentReference"/>
-        </w:rPr>
-        <w:annotationRef/>
-      </w:r>
-      <w:r>
-        <w:t>This whole piece will be different</w:t>
-      </w:r>
-    </w:p>
-  </w:comment>
 </w:comments>
 </file>
 
@@ -8915,8 +8614,6 @@
   <w15:commentEx w15:paraId="2CCE9B09" w15:done="0"/>
   <w15:commentEx w15:paraId="2BEE10A3" w15:done="0"/>
   <w15:commentEx w15:paraId="736BFCA7" w15:done="0"/>
-  <w15:commentEx w15:paraId="27D5BA5C" w15:done="0"/>
-  <w15:commentEx w15:paraId="220ED81E" w15:done="0"/>
 </w15:commentsEx>
 </file>
 
@@ -8925,8 +8622,6 @@
   <w16cex:commentExtensible w16cex:durableId="1DD21039" w16cex:dateUtc="2026-06-12T20:46:00Z"/>
   <w16cex:commentExtensible w16cex:durableId="4B1497F6" w16cex:dateUtc="2026-06-15T20:20:00Z"/>
   <w16cex:commentExtensible w16cex:durableId="1CBC99B8" w16cex:dateUtc="2026-06-15T22:42:00Z"/>
-  <w16cex:commentExtensible w16cex:durableId="052C9960" w16cex:dateUtc="2026-06-06T01:19:00Z"/>
-  <w16cex:commentExtensible w16cex:durableId="259A6C5D" w16cex:dateUtc="2026-06-15T23:11:00Z"/>
 </w16cex:commentsExtensible>
 </file>
 
@@ -8935,8 +8630,6 @@
   <w16cid:commentId w16cid:paraId="2CCE9B09" w16cid:durableId="1DD21039"/>
   <w16cid:commentId w16cid:paraId="2BEE10A3" w16cid:durableId="4B1497F6"/>
   <w16cid:commentId w16cid:paraId="736BFCA7" w16cid:durableId="1CBC99B8"/>
-  <w16cid:commentId w16cid:paraId="27D5BA5C" w16cid:durableId="052C9960"/>
-  <w16cid:commentId w16cid:paraId="220ED81E" w16cid:durableId="259A6C5D"/>
 </w16cid:commentsIds>
 </file>
 

</xml_diff>